<commit_message>
JavaDoc for classes names
</commit_message>
<xml_diff>
--- a/IzvjestajAlgoritmi.docx
+++ b/IzvjestajAlgoritmi.docx
@@ -23,6 +23,7 @@
     <w:p>
       <w:pPr>
         <w:ind w:firstLine="720"/>
+        <w:jc w:val="both"/>
       </w:pPr>
       <w:r>
         <w:t xml:space="preserve">Dijkstra </w:t>
@@ -247,6 +248,7 @@
     <w:p>
       <w:pPr>
         <w:ind w:firstLine="720"/>
+        <w:jc w:val="both"/>
       </w:pPr>
       <w:r>
         <w:t xml:space="preserve">U </w:t>
@@ -400,15 +402,18 @@
       </w:r>
       <w:proofErr w:type="spellStart"/>
       <w:r>
-        <w:t>moguće</w:t>
-      </w:r>
-      <w:proofErr w:type="spellEnd"/>
-      <w:r>
-        <w:t xml:space="preserve"> </w:t>
-      </w:r>
-      <w:proofErr w:type="spellStart"/>
-      <w:r>
-        <w:t>rute</w:t>
+        <w:t>moguć</w:t>
+      </w:r>
+      <w:r>
+        <w:t>a</w:t>
+      </w:r>
+      <w:proofErr w:type="spellEnd"/>
+      <w:r>
+        <w:t xml:space="preserve"> </w:t>
+      </w:r>
+      <w:proofErr w:type="spellStart"/>
+      <w:r>
+        <w:t>putovanja</w:t>
       </w:r>
       <w:proofErr w:type="spellEnd"/>
       <w:r>
@@ -781,6 +786,7 @@
     <w:p>
       <w:pPr>
         <w:ind w:firstLine="720"/>
+        <w:jc w:val="both"/>
         <w:rPr>
           <w:lang w:val="sr-Latn-RS"/>
         </w:rPr>
@@ -813,6 +819,7 @@
     <w:p>
       <w:pPr>
         <w:ind w:firstLine="720"/>
+        <w:jc w:val="both"/>
         <w:rPr>
           <w:lang w:val="sr-Latn-RS"/>
         </w:rPr>
@@ -910,445 +917,1100 @@
         </w:rPr>
         <w:t>Yen algoritam</w:t>
       </w:r>
-    </w:p>
-    <w:p>
-      <w:pPr>
-        <w:ind w:firstLine="720"/>
-      </w:pPr>
-      <w:r>
-        <w:t xml:space="preserve">Yen </w:t>
-      </w:r>
-      <w:proofErr w:type="spellStart"/>
-      <w:r>
-        <w:t>algoritam</w:t>
-      </w:r>
-      <w:proofErr w:type="spellEnd"/>
-      <w:r>
-        <w:t xml:space="preserve"> se </w:t>
-      </w:r>
-      <w:proofErr w:type="spellStart"/>
-      <w:r>
-        <w:t>koristi</w:t>
-      </w:r>
-      <w:proofErr w:type="spellEnd"/>
-      <w:r>
-        <w:t xml:space="preserve"> za </w:t>
-      </w:r>
-      <w:proofErr w:type="spellStart"/>
-      <w:r>
-        <w:t>pronalaženje</w:t>
-      </w:r>
-      <w:proofErr w:type="spellEnd"/>
-      <w:r>
-        <w:t xml:space="preserve"> </w:t>
-      </w:r>
-      <w:proofErr w:type="spellStart"/>
-      <w:r>
-        <w:t>više</w:t>
-      </w:r>
-      <w:proofErr w:type="spellEnd"/>
-      <w:r>
-        <w:t xml:space="preserve"> </w:t>
-      </w:r>
-      <w:proofErr w:type="spellStart"/>
-      <w:r>
-        <w:t>najboljih</w:t>
-      </w:r>
-      <w:proofErr w:type="spellEnd"/>
-      <w:r>
-        <w:t xml:space="preserve"> </w:t>
-      </w:r>
-      <w:proofErr w:type="spellStart"/>
-      <w:r>
-        <w:t>putanja</w:t>
-      </w:r>
-      <w:proofErr w:type="spellEnd"/>
-      <w:r>
-        <w:t xml:space="preserve"> </w:t>
-      </w:r>
-      <w:proofErr w:type="spellStart"/>
-      <w:r>
-        <w:t>između</w:t>
-      </w:r>
-      <w:proofErr w:type="spellEnd"/>
-      <w:r>
-        <w:t xml:space="preserve"> </w:t>
-      </w:r>
-      <w:proofErr w:type="spellStart"/>
-      <w:r>
-        <w:t>dva</w:t>
-      </w:r>
-      <w:proofErr w:type="spellEnd"/>
-      <w:r>
-        <w:t xml:space="preserve"> </w:t>
-      </w:r>
-      <w:proofErr w:type="spellStart"/>
-      <w:proofErr w:type="gramStart"/>
-      <w:r>
-        <w:t>čvora</w:t>
-      </w:r>
-      <w:proofErr w:type="spellEnd"/>
-      <w:r>
-        <w:t>(</w:t>
-      </w:r>
-      <w:proofErr w:type="gramEnd"/>
-      <w:r>
-        <w:t xml:space="preserve">u </w:t>
-      </w:r>
-      <w:proofErr w:type="spellStart"/>
-      <w:r>
-        <w:t>projektu</w:t>
-      </w:r>
-      <w:proofErr w:type="spellEnd"/>
-      <w:r>
-        <w:t xml:space="preserve"> 5)</w:t>
-      </w:r>
-      <w:r>
-        <w:t xml:space="preserve">, ne </w:t>
-      </w:r>
-      <w:proofErr w:type="spellStart"/>
-      <w:r>
-        <w:t>samo</w:t>
-      </w:r>
-      <w:proofErr w:type="spellEnd"/>
-      <w:r>
-        <w:t xml:space="preserve"> one </w:t>
-      </w:r>
-      <w:proofErr w:type="spellStart"/>
-      <w:r>
-        <w:t>najkraće</w:t>
-      </w:r>
-      <w:proofErr w:type="spellEnd"/>
-      <w:r>
-        <w:t xml:space="preserve">. On </w:t>
-      </w:r>
-      <w:proofErr w:type="spellStart"/>
-      <w:r>
-        <w:t>zapravo</w:t>
-      </w:r>
-      <w:proofErr w:type="spellEnd"/>
-      <w:r>
-        <w:t xml:space="preserve"> </w:t>
-      </w:r>
-      <w:proofErr w:type="spellStart"/>
-      <w:r>
-        <w:t>koristi</w:t>
-      </w:r>
-      <w:proofErr w:type="spellEnd"/>
-      <w:r>
-        <w:t xml:space="preserve"> Dijkstra </w:t>
-      </w:r>
-      <w:proofErr w:type="spellStart"/>
-      <w:r>
-        <w:t>algoritam</w:t>
-      </w:r>
-      <w:proofErr w:type="spellEnd"/>
-      <w:r>
-        <w:t xml:space="preserve"> da </w:t>
-      </w:r>
-      <w:proofErr w:type="spellStart"/>
-      <w:r>
-        <w:t>pronađe</w:t>
-      </w:r>
-      <w:proofErr w:type="spellEnd"/>
-      <w:r>
-        <w:t xml:space="preserve"> </w:t>
-      </w:r>
-      <w:proofErr w:type="spellStart"/>
-      <w:r>
-        <w:t>prvu</w:t>
-      </w:r>
-      <w:proofErr w:type="spellEnd"/>
-      <w:r>
-        <w:t xml:space="preserve">, </w:t>
-      </w:r>
-      <w:proofErr w:type="spellStart"/>
-      <w:r>
-        <w:t>najkraću</w:t>
-      </w:r>
-      <w:proofErr w:type="spellEnd"/>
-      <w:r>
-        <w:t xml:space="preserve"> </w:t>
-      </w:r>
-      <w:proofErr w:type="spellStart"/>
-      <w:r>
-        <w:t>putanju</w:t>
-      </w:r>
-      <w:proofErr w:type="spellEnd"/>
-      <w:r>
-        <w:t xml:space="preserve">, a </w:t>
-      </w:r>
-      <w:proofErr w:type="spellStart"/>
-      <w:r>
-        <w:t>zatim</w:t>
-      </w:r>
-      <w:proofErr w:type="spellEnd"/>
-      <w:r>
-        <w:t xml:space="preserve"> </w:t>
-      </w:r>
-      <w:proofErr w:type="spellStart"/>
-      <w:r>
-        <w:t>kreira</w:t>
-      </w:r>
-      <w:proofErr w:type="spellEnd"/>
-      <w:r>
-        <w:t xml:space="preserve"> </w:t>
-      </w:r>
-      <w:proofErr w:type="spellStart"/>
-      <w:r>
-        <w:t>alternativne</w:t>
-      </w:r>
-      <w:proofErr w:type="spellEnd"/>
-      <w:r>
-        <w:t xml:space="preserve"> </w:t>
-      </w:r>
-      <w:proofErr w:type="spellStart"/>
-      <w:r>
-        <w:t>rute</w:t>
-      </w:r>
-      <w:proofErr w:type="spellEnd"/>
-      <w:r>
-        <w:t xml:space="preserve"> </w:t>
-      </w:r>
-      <w:proofErr w:type="spellStart"/>
-      <w:r>
-        <w:t>tako</w:t>
-      </w:r>
-      <w:proofErr w:type="spellEnd"/>
-      <w:r>
-        <w:t xml:space="preserve"> </w:t>
-      </w:r>
-      <w:proofErr w:type="spellStart"/>
-      <w:r>
-        <w:t>što</w:t>
-      </w:r>
-      <w:proofErr w:type="spellEnd"/>
-      <w:r>
-        <w:t xml:space="preserve"> </w:t>
-      </w:r>
-      <w:proofErr w:type="spellStart"/>
-      <w:r>
-        <w:t>privremeno</w:t>
-      </w:r>
-      <w:proofErr w:type="spellEnd"/>
-      <w:r>
-        <w:t xml:space="preserve"> </w:t>
-      </w:r>
-      <w:proofErr w:type="spellStart"/>
-      <w:r>
-        <w:t>uklanja</w:t>
-      </w:r>
-      <w:proofErr w:type="spellEnd"/>
-      <w:r>
-        <w:t xml:space="preserve"> </w:t>
-      </w:r>
-      <w:proofErr w:type="spellStart"/>
-      <w:r>
-        <w:t>ili</w:t>
-      </w:r>
-      <w:proofErr w:type="spellEnd"/>
-      <w:r>
-        <w:t xml:space="preserve"> </w:t>
-      </w:r>
-      <w:proofErr w:type="spellStart"/>
-      <w:r>
-        <w:t>blokira</w:t>
-      </w:r>
-      <w:proofErr w:type="spellEnd"/>
-      <w:r>
-        <w:t xml:space="preserve"> </w:t>
-      </w:r>
-      <w:proofErr w:type="spellStart"/>
-      <w:r>
-        <w:t>dijelove</w:t>
-      </w:r>
-      <w:proofErr w:type="spellEnd"/>
-      <w:r>
-        <w:t xml:space="preserve"> </w:t>
-      </w:r>
-      <w:proofErr w:type="spellStart"/>
-      <w:r>
-        <w:t>prethodno</w:t>
-      </w:r>
-      <w:proofErr w:type="spellEnd"/>
-      <w:r>
-        <w:t xml:space="preserve"> </w:t>
-      </w:r>
-      <w:proofErr w:type="spellStart"/>
-      <w:r>
-        <w:t>pronađenih</w:t>
-      </w:r>
-      <w:proofErr w:type="spellEnd"/>
-      <w:r>
-        <w:t xml:space="preserve"> </w:t>
-      </w:r>
-      <w:proofErr w:type="spellStart"/>
-      <w:r>
-        <w:t>puteva</w:t>
-      </w:r>
-      <w:proofErr w:type="spellEnd"/>
-      <w:r>
-        <w:t xml:space="preserve">. Na </w:t>
-      </w:r>
-      <w:proofErr w:type="spellStart"/>
-      <w:r>
-        <w:t>taj</w:t>
-      </w:r>
-      <w:proofErr w:type="spellEnd"/>
-      <w:r>
-        <w:t xml:space="preserve"> </w:t>
-      </w:r>
-      <w:proofErr w:type="spellStart"/>
-      <w:r>
-        <w:t>način</w:t>
-      </w:r>
-      <w:proofErr w:type="spellEnd"/>
-      <w:r>
-        <w:t xml:space="preserve"> </w:t>
-      </w:r>
-      <w:proofErr w:type="spellStart"/>
-      <w:r>
-        <w:t>može</w:t>
-      </w:r>
-      <w:proofErr w:type="spellEnd"/>
-      <w:r>
-        <w:t xml:space="preserve"> se </w:t>
-      </w:r>
-      <w:proofErr w:type="spellStart"/>
-      <w:r>
-        <w:t>dobiti</w:t>
-      </w:r>
-      <w:proofErr w:type="spellEnd"/>
-      <w:r>
-        <w:t xml:space="preserve"> </w:t>
-      </w:r>
-      <w:proofErr w:type="spellStart"/>
-      <w:r>
-        <w:t>druga</w:t>
-      </w:r>
-      <w:proofErr w:type="spellEnd"/>
-      <w:r>
-        <w:t xml:space="preserve">, </w:t>
-      </w:r>
-      <w:proofErr w:type="spellStart"/>
-      <w:proofErr w:type="gramStart"/>
-      <w:r>
-        <w:t>treća</w:t>
-      </w:r>
-      <w:proofErr w:type="spellEnd"/>
-      <w:r>
-        <w:t>,...</w:t>
-      </w:r>
-      <w:proofErr w:type="gramEnd"/>
-      <w:r>
-        <w:t xml:space="preserve"> </w:t>
-      </w:r>
-      <w:proofErr w:type="spellStart"/>
-      <w:r>
-        <w:t>ruta</w:t>
-      </w:r>
-      <w:proofErr w:type="spellEnd"/>
-      <w:r>
-        <w:t xml:space="preserve">. </w:t>
-      </w:r>
-      <w:proofErr w:type="spellStart"/>
-      <w:r>
-        <w:t>Možemo</w:t>
-      </w:r>
-      <w:proofErr w:type="spellEnd"/>
-      <w:r>
-        <w:t xml:space="preserve"> </w:t>
-      </w:r>
-      <w:proofErr w:type="spellStart"/>
-      <w:r>
-        <w:t>ih</w:t>
-      </w:r>
-      <w:proofErr w:type="spellEnd"/>
-      <w:r>
-        <w:t xml:space="preserve"> </w:t>
-      </w:r>
-      <w:proofErr w:type="spellStart"/>
-      <w:proofErr w:type="gramStart"/>
-      <w:r>
-        <w:t>zvati</w:t>
-      </w:r>
-      <w:proofErr w:type="spellEnd"/>
-      <w:r>
-        <w:t xml:space="preserve"> :</w:t>
-      </w:r>
-      <w:proofErr w:type="gramEnd"/>
-      <w:r>
-        <w:t xml:space="preserve"> “</w:t>
-      </w:r>
-      <w:proofErr w:type="spellStart"/>
-      <w:r>
-        <w:t>sljedeće</w:t>
-      </w:r>
-      <w:proofErr w:type="spellEnd"/>
-      <w:r>
-        <w:t xml:space="preserve"> </w:t>
-      </w:r>
-      <w:proofErr w:type="spellStart"/>
-      <w:r>
-        <w:t>najbolje</w:t>
-      </w:r>
-      <w:proofErr w:type="spellEnd"/>
-      <w:r>
-        <w:t xml:space="preserve"> </w:t>
-      </w:r>
-      <w:proofErr w:type="spellStart"/>
-      <w:r>
-        <w:t>rute</w:t>
-      </w:r>
-      <w:proofErr w:type="spellEnd"/>
-      <w:r>
-        <w:t xml:space="preserve">” </w:t>
-      </w:r>
-      <w:proofErr w:type="spellStart"/>
-      <w:r>
-        <w:t>i</w:t>
-      </w:r>
-      <w:proofErr w:type="spellEnd"/>
-      <w:r>
-        <w:t xml:space="preserve"> one </w:t>
-      </w:r>
-      <w:proofErr w:type="spellStart"/>
-      <w:r>
-        <w:t>su</w:t>
-      </w:r>
-      <w:proofErr w:type="spellEnd"/>
-      <w:r>
-        <w:t xml:space="preserve"> </w:t>
-      </w:r>
-      <w:proofErr w:type="spellStart"/>
-      <w:r>
-        <w:t>različite</w:t>
-      </w:r>
-      <w:proofErr w:type="spellEnd"/>
-      <w:r>
-        <w:t xml:space="preserve"> </w:t>
-      </w:r>
-      <w:proofErr w:type="spellStart"/>
-      <w:r>
-        <w:t>međusobno</w:t>
-      </w:r>
-      <w:proofErr w:type="spellEnd"/>
-      <w:r>
-        <w:t xml:space="preserve">. </w:t>
-      </w:r>
-    </w:p>
-    <w:p>
-      <w:pPr>
-        <w:ind w:firstLine="720"/>
-      </w:pPr>
       <w:bookmarkStart w:id="0" w:name="_GoBack"/>
       <w:bookmarkEnd w:id="0"/>
     </w:p>
     <w:p>
       <w:pPr>
-        <w:rPr>
-          <w:lang w:val="sr-Latn-RS"/>
-        </w:rPr>
+        <w:ind w:firstLine="720"/>
+        <w:jc w:val="both"/>
+      </w:pPr>
+      <w:r>
+        <w:t xml:space="preserve">Yen </w:t>
+      </w:r>
+      <w:proofErr w:type="spellStart"/>
+      <w:r>
+        <w:t>algoritam</w:t>
+      </w:r>
+      <w:proofErr w:type="spellEnd"/>
+      <w:r>
+        <w:t xml:space="preserve"> se </w:t>
+      </w:r>
+      <w:proofErr w:type="spellStart"/>
+      <w:r>
+        <w:t>koristi</w:t>
+      </w:r>
+      <w:proofErr w:type="spellEnd"/>
+      <w:r>
+        <w:t xml:space="preserve"> za </w:t>
+      </w:r>
+      <w:proofErr w:type="spellStart"/>
+      <w:r>
+        <w:t>pronalaženje</w:t>
+      </w:r>
+      <w:proofErr w:type="spellEnd"/>
+      <w:r>
+        <w:t xml:space="preserve"> </w:t>
+      </w:r>
+      <w:proofErr w:type="spellStart"/>
+      <w:r>
+        <w:t>više</w:t>
+      </w:r>
+      <w:proofErr w:type="spellEnd"/>
+      <w:r>
+        <w:t xml:space="preserve"> </w:t>
+      </w:r>
+      <w:proofErr w:type="spellStart"/>
+      <w:r>
+        <w:t>najboljih</w:t>
+      </w:r>
+      <w:proofErr w:type="spellEnd"/>
+      <w:r>
+        <w:t xml:space="preserve"> </w:t>
+      </w:r>
+      <w:proofErr w:type="spellStart"/>
+      <w:r>
+        <w:t>putanja</w:t>
+      </w:r>
+      <w:proofErr w:type="spellEnd"/>
+      <w:r>
+        <w:t xml:space="preserve"> </w:t>
+      </w:r>
+      <w:proofErr w:type="spellStart"/>
+      <w:r>
+        <w:t>između</w:t>
+      </w:r>
+      <w:proofErr w:type="spellEnd"/>
+      <w:r>
+        <w:t xml:space="preserve"> </w:t>
+      </w:r>
+      <w:proofErr w:type="spellStart"/>
+      <w:r>
+        <w:t>dva</w:t>
+      </w:r>
+      <w:proofErr w:type="spellEnd"/>
+      <w:r>
+        <w:t xml:space="preserve"> </w:t>
+      </w:r>
+      <w:proofErr w:type="spellStart"/>
+      <w:proofErr w:type="gramStart"/>
+      <w:r>
+        <w:t>čvora</w:t>
+      </w:r>
+      <w:proofErr w:type="spellEnd"/>
+      <w:r>
+        <w:t>(</w:t>
+      </w:r>
+      <w:proofErr w:type="gramEnd"/>
+      <w:r>
+        <w:t xml:space="preserve">u </w:t>
+      </w:r>
+      <w:proofErr w:type="spellStart"/>
+      <w:r>
+        <w:t>projektu</w:t>
+      </w:r>
+      <w:proofErr w:type="spellEnd"/>
+      <w:r>
+        <w:t xml:space="preserve"> 5)</w:t>
+      </w:r>
+      <w:r>
+        <w:t xml:space="preserve">, ne </w:t>
+      </w:r>
+      <w:proofErr w:type="spellStart"/>
+      <w:r>
+        <w:t>samo</w:t>
+      </w:r>
+      <w:proofErr w:type="spellEnd"/>
+      <w:r>
+        <w:t xml:space="preserve"> one </w:t>
+      </w:r>
+      <w:proofErr w:type="spellStart"/>
+      <w:r>
+        <w:t>najkraće</w:t>
+      </w:r>
+      <w:proofErr w:type="spellEnd"/>
+      <w:r>
+        <w:t xml:space="preserve">. On </w:t>
+      </w:r>
+      <w:proofErr w:type="spellStart"/>
+      <w:r>
+        <w:t>zapravo</w:t>
+      </w:r>
+      <w:proofErr w:type="spellEnd"/>
+      <w:r>
+        <w:t xml:space="preserve"> </w:t>
+      </w:r>
+      <w:proofErr w:type="spellStart"/>
+      <w:r>
+        <w:t>koristi</w:t>
+      </w:r>
+      <w:proofErr w:type="spellEnd"/>
+      <w:r>
+        <w:t xml:space="preserve"> Dijkstra </w:t>
+      </w:r>
+      <w:proofErr w:type="spellStart"/>
+      <w:r>
+        <w:t>algoritam</w:t>
+      </w:r>
+      <w:proofErr w:type="spellEnd"/>
+      <w:r>
+        <w:t xml:space="preserve"> da </w:t>
+      </w:r>
+      <w:proofErr w:type="spellStart"/>
+      <w:r>
+        <w:t>pronađe</w:t>
+      </w:r>
+      <w:proofErr w:type="spellEnd"/>
+      <w:r>
+        <w:t xml:space="preserve"> </w:t>
+      </w:r>
+      <w:proofErr w:type="spellStart"/>
+      <w:r>
+        <w:t>prvu</w:t>
+      </w:r>
+      <w:proofErr w:type="spellEnd"/>
+      <w:r>
+        <w:t xml:space="preserve">, </w:t>
+      </w:r>
+      <w:proofErr w:type="spellStart"/>
+      <w:r>
+        <w:t>najkraću</w:t>
+      </w:r>
+      <w:proofErr w:type="spellEnd"/>
+      <w:r>
+        <w:t xml:space="preserve"> </w:t>
+      </w:r>
+      <w:proofErr w:type="spellStart"/>
+      <w:r>
+        <w:t>putanju</w:t>
+      </w:r>
+      <w:proofErr w:type="spellEnd"/>
+      <w:r>
+        <w:t xml:space="preserve">, a </w:t>
+      </w:r>
+      <w:proofErr w:type="spellStart"/>
+      <w:r>
+        <w:t>zatim</w:t>
+      </w:r>
+      <w:proofErr w:type="spellEnd"/>
+      <w:r>
+        <w:t xml:space="preserve"> </w:t>
+      </w:r>
+      <w:proofErr w:type="spellStart"/>
+      <w:r>
+        <w:t>kreira</w:t>
+      </w:r>
+      <w:proofErr w:type="spellEnd"/>
+      <w:r>
+        <w:t xml:space="preserve"> </w:t>
+      </w:r>
+      <w:proofErr w:type="spellStart"/>
+      <w:r>
+        <w:t>alternativne</w:t>
+      </w:r>
+      <w:proofErr w:type="spellEnd"/>
+      <w:r>
+        <w:t xml:space="preserve"> </w:t>
+      </w:r>
+      <w:proofErr w:type="spellStart"/>
+      <w:r>
+        <w:t>rute</w:t>
+      </w:r>
+      <w:proofErr w:type="spellEnd"/>
+      <w:r>
+        <w:t xml:space="preserve"> </w:t>
+      </w:r>
+      <w:proofErr w:type="spellStart"/>
+      <w:r>
+        <w:t>tako</w:t>
+      </w:r>
+      <w:proofErr w:type="spellEnd"/>
+      <w:r>
+        <w:t xml:space="preserve"> </w:t>
+      </w:r>
+      <w:proofErr w:type="spellStart"/>
+      <w:r>
+        <w:t>što</w:t>
+      </w:r>
+      <w:proofErr w:type="spellEnd"/>
+      <w:r>
+        <w:t xml:space="preserve"> </w:t>
+      </w:r>
+      <w:proofErr w:type="spellStart"/>
+      <w:r>
+        <w:t>privremeno</w:t>
+      </w:r>
+      <w:proofErr w:type="spellEnd"/>
+      <w:r>
+        <w:t xml:space="preserve"> </w:t>
+      </w:r>
+      <w:proofErr w:type="spellStart"/>
+      <w:r>
+        <w:t>uklanja</w:t>
+      </w:r>
+      <w:proofErr w:type="spellEnd"/>
+      <w:r>
+        <w:t xml:space="preserve"> </w:t>
+      </w:r>
+      <w:proofErr w:type="spellStart"/>
+      <w:r>
+        <w:t>ili</w:t>
+      </w:r>
+      <w:proofErr w:type="spellEnd"/>
+      <w:r>
+        <w:t xml:space="preserve"> </w:t>
+      </w:r>
+      <w:proofErr w:type="spellStart"/>
+      <w:r>
+        <w:t>blokira</w:t>
+      </w:r>
+      <w:proofErr w:type="spellEnd"/>
+      <w:r>
+        <w:t xml:space="preserve"> </w:t>
+      </w:r>
+      <w:proofErr w:type="spellStart"/>
+      <w:r>
+        <w:t>dijelove</w:t>
+      </w:r>
+      <w:proofErr w:type="spellEnd"/>
+      <w:r>
+        <w:t xml:space="preserve"> </w:t>
+      </w:r>
+      <w:proofErr w:type="spellStart"/>
+      <w:r>
+        <w:t>prethodno</w:t>
+      </w:r>
+      <w:proofErr w:type="spellEnd"/>
+      <w:r>
+        <w:t xml:space="preserve"> </w:t>
+      </w:r>
+      <w:proofErr w:type="spellStart"/>
+      <w:r>
+        <w:t>pronađenih</w:t>
+      </w:r>
+      <w:proofErr w:type="spellEnd"/>
+      <w:r>
+        <w:t xml:space="preserve"> </w:t>
+      </w:r>
+      <w:proofErr w:type="spellStart"/>
+      <w:r>
+        <w:t>puteva</w:t>
+      </w:r>
+      <w:proofErr w:type="spellEnd"/>
+      <w:r>
+        <w:t xml:space="preserve">. Na </w:t>
+      </w:r>
+      <w:proofErr w:type="spellStart"/>
+      <w:r>
+        <w:t>taj</w:t>
+      </w:r>
+      <w:proofErr w:type="spellEnd"/>
+      <w:r>
+        <w:t xml:space="preserve"> </w:t>
+      </w:r>
+      <w:proofErr w:type="spellStart"/>
+      <w:r>
+        <w:t>način</w:t>
+      </w:r>
+      <w:proofErr w:type="spellEnd"/>
+      <w:r>
+        <w:t xml:space="preserve"> </w:t>
+      </w:r>
+      <w:proofErr w:type="spellStart"/>
+      <w:r>
+        <w:t>može</w:t>
+      </w:r>
+      <w:proofErr w:type="spellEnd"/>
+      <w:r>
+        <w:t xml:space="preserve"> se </w:t>
+      </w:r>
+      <w:proofErr w:type="spellStart"/>
+      <w:r>
+        <w:t>dobiti</w:t>
+      </w:r>
+      <w:proofErr w:type="spellEnd"/>
+      <w:r>
+        <w:t xml:space="preserve"> </w:t>
+      </w:r>
+      <w:proofErr w:type="spellStart"/>
+      <w:r>
+        <w:t>druga</w:t>
+      </w:r>
+      <w:proofErr w:type="spellEnd"/>
+      <w:r>
+        <w:t xml:space="preserve">, </w:t>
+      </w:r>
+      <w:proofErr w:type="spellStart"/>
+      <w:proofErr w:type="gramStart"/>
+      <w:r>
+        <w:t>treća</w:t>
+      </w:r>
+      <w:proofErr w:type="spellEnd"/>
+      <w:r>
+        <w:t>,..</w:t>
+      </w:r>
+      <w:proofErr w:type="gramEnd"/>
+      <w:r>
+        <w:t>, peta</w:t>
+      </w:r>
+      <w:r>
+        <w:t xml:space="preserve"> </w:t>
+      </w:r>
+      <w:proofErr w:type="spellStart"/>
+      <w:r>
+        <w:t>ruta</w:t>
+      </w:r>
+      <w:proofErr w:type="spellEnd"/>
+      <w:r>
+        <w:t xml:space="preserve">. </w:t>
+      </w:r>
+      <w:proofErr w:type="spellStart"/>
+      <w:r>
+        <w:t>Možemo</w:t>
+      </w:r>
+      <w:proofErr w:type="spellEnd"/>
+      <w:r>
+        <w:t xml:space="preserve"> </w:t>
+      </w:r>
+      <w:proofErr w:type="spellStart"/>
+      <w:r>
+        <w:t>ih</w:t>
+      </w:r>
+      <w:proofErr w:type="spellEnd"/>
+      <w:r>
+        <w:t xml:space="preserve"> </w:t>
+      </w:r>
+      <w:proofErr w:type="spellStart"/>
+      <w:proofErr w:type="gramStart"/>
+      <w:r>
+        <w:t>zvati</w:t>
+      </w:r>
+      <w:proofErr w:type="spellEnd"/>
+      <w:r>
+        <w:t xml:space="preserve"> :</w:t>
+      </w:r>
+      <w:proofErr w:type="gramEnd"/>
+      <w:r>
+        <w:t xml:space="preserve"> “</w:t>
+      </w:r>
+      <w:proofErr w:type="spellStart"/>
+      <w:r>
+        <w:t>sljedeće</w:t>
+      </w:r>
+      <w:proofErr w:type="spellEnd"/>
+      <w:r>
+        <w:t xml:space="preserve"> </w:t>
+      </w:r>
+      <w:proofErr w:type="spellStart"/>
+      <w:r>
+        <w:t>najbolje</w:t>
+      </w:r>
+      <w:proofErr w:type="spellEnd"/>
+      <w:r>
+        <w:t xml:space="preserve"> </w:t>
+      </w:r>
+      <w:proofErr w:type="spellStart"/>
+      <w:r>
+        <w:t>rute</w:t>
+      </w:r>
+      <w:proofErr w:type="spellEnd"/>
+      <w:r>
+        <w:t xml:space="preserve">” </w:t>
+      </w:r>
+      <w:proofErr w:type="spellStart"/>
+      <w:r>
+        <w:t>i</w:t>
+      </w:r>
+      <w:proofErr w:type="spellEnd"/>
+      <w:r>
+        <w:t xml:space="preserve"> one </w:t>
+      </w:r>
+      <w:proofErr w:type="spellStart"/>
+      <w:r>
+        <w:t>su</w:t>
+      </w:r>
+      <w:proofErr w:type="spellEnd"/>
+      <w:r>
+        <w:t xml:space="preserve"> </w:t>
+      </w:r>
+      <w:proofErr w:type="spellStart"/>
+      <w:r>
+        <w:t>različite</w:t>
+      </w:r>
+      <w:proofErr w:type="spellEnd"/>
+      <w:r>
+        <w:t xml:space="preserve"> </w:t>
+      </w:r>
+      <w:proofErr w:type="spellStart"/>
+      <w:r>
+        <w:t>međusobno</w:t>
+      </w:r>
+      <w:proofErr w:type="spellEnd"/>
+      <w:r>
+        <w:t xml:space="preserve">. </w:t>
+      </w:r>
+    </w:p>
+    <w:p>
+      <w:pPr>
+        <w:ind w:firstLine="720"/>
+        <w:jc w:val="both"/>
+      </w:pPr>
+      <w:r>
+        <w:t xml:space="preserve">On </w:t>
+      </w:r>
+      <w:proofErr w:type="spellStart"/>
+      <w:r>
+        <w:t>zapravo</w:t>
+      </w:r>
+      <w:proofErr w:type="spellEnd"/>
+      <w:r>
+        <w:t xml:space="preserve"> </w:t>
+      </w:r>
+      <w:proofErr w:type="spellStart"/>
+      <w:r>
+        <w:t>kreira</w:t>
+      </w:r>
+      <w:proofErr w:type="spellEnd"/>
+      <w:r>
+        <w:t xml:space="preserve"> </w:t>
+      </w:r>
+      <w:proofErr w:type="spellStart"/>
+      <w:r>
+        <w:t>alternativne</w:t>
+      </w:r>
+      <w:proofErr w:type="spellEnd"/>
+      <w:r>
+        <w:t xml:space="preserve"> (spur) </w:t>
+      </w:r>
+      <w:proofErr w:type="spellStart"/>
+      <w:r>
+        <w:t>rute</w:t>
+      </w:r>
+      <w:proofErr w:type="spellEnd"/>
+      <w:r>
+        <w:t xml:space="preserve"> </w:t>
+      </w:r>
+      <w:proofErr w:type="spellStart"/>
+      <w:r>
+        <w:t>uklanjanjem</w:t>
+      </w:r>
+      <w:proofErr w:type="spellEnd"/>
+      <w:r>
+        <w:t xml:space="preserve"> </w:t>
+      </w:r>
+      <w:proofErr w:type="spellStart"/>
+      <w:r>
+        <w:t>dijelova</w:t>
+      </w:r>
+      <w:proofErr w:type="spellEnd"/>
+      <w:r>
+        <w:t xml:space="preserve"> </w:t>
+      </w:r>
+      <w:proofErr w:type="spellStart"/>
+      <w:r>
+        <w:t>prethodno</w:t>
+      </w:r>
+      <w:proofErr w:type="spellEnd"/>
+      <w:r>
+        <w:t xml:space="preserve"> </w:t>
+      </w:r>
+      <w:proofErr w:type="spellStart"/>
+      <w:r>
+        <w:t>pronadjenih</w:t>
+      </w:r>
+      <w:proofErr w:type="spellEnd"/>
+      <w:r>
+        <w:t xml:space="preserve"> </w:t>
+      </w:r>
+      <w:proofErr w:type="spellStart"/>
+      <w:r>
+        <w:t>puteva</w:t>
+      </w:r>
+      <w:proofErr w:type="spellEnd"/>
+      <w:r>
+        <w:t xml:space="preserve">. </w:t>
+      </w:r>
+      <w:proofErr w:type="spellStart"/>
+      <w:r>
+        <w:t>Ponovo</w:t>
+      </w:r>
+      <w:proofErr w:type="spellEnd"/>
+      <w:r>
+        <w:t xml:space="preserve"> </w:t>
+      </w:r>
+      <w:proofErr w:type="spellStart"/>
+      <w:r>
+        <w:t>pokreće</w:t>
+      </w:r>
+      <w:proofErr w:type="spellEnd"/>
+      <w:r>
+        <w:t xml:space="preserve"> </w:t>
+      </w:r>
+      <w:proofErr w:type="spellStart"/>
+      <w:r>
+        <w:t>Dijkstru</w:t>
+      </w:r>
+      <w:proofErr w:type="spellEnd"/>
+      <w:r>
+        <w:t xml:space="preserve"> </w:t>
+      </w:r>
+      <w:proofErr w:type="spellStart"/>
+      <w:r>
+        <w:t>i</w:t>
+      </w:r>
+      <w:proofErr w:type="spellEnd"/>
+      <w:r>
+        <w:t xml:space="preserve"> </w:t>
+      </w:r>
+      <w:proofErr w:type="spellStart"/>
+      <w:r>
+        <w:t>traži</w:t>
+      </w:r>
+      <w:proofErr w:type="spellEnd"/>
+      <w:r>
+        <w:t xml:space="preserve"> </w:t>
+      </w:r>
+      <w:proofErr w:type="spellStart"/>
+      <w:r>
+        <w:t>sljedeće</w:t>
+      </w:r>
+      <w:proofErr w:type="spellEnd"/>
+      <w:r>
+        <w:t xml:space="preserve"> </w:t>
+      </w:r>
+      <w:proofErr w:type="spellStart"/>
+      <w:r>
+        <w:t>najbolje</w:t>
+      </w:r>
+      <w:proofErr w:type="spellEnd"/>
+      <w:r>
+        <w:t xml:space="preserve"> </w:t>
+      </w:r>
+      <w:proofErr w:type="spellStart"/>
+      <w:r>
+        <w:t>opcije</w:t>
+      </w:r>
+      <w:proofErr w:type="spellEnd"/>
+      <w:r>
+        <w:t xml:space="preserve">. </w:t>
+      </w:r>
+    </w:p>
+    <w:p>
+      <w:pPr>
+        <w:ind w:firstLine="720"/>
+        <w:jc w:val="both"/>
+      </w:pPr>
+      <w:r>
+        <w:t xml:space="preserve">U </w:t>
+      </w:r>
+      <w:proofErr w:type="spellStart"/>
+      <w:r>
+        <w:t>projektu</w:t>
+      </w:r>
+      <w:proofErr w:type="spellEnd"/>
+      <w:r>
+        <w:t xml:space="preserve"> </w:t>
+      </w:r>
+      <w:proofErr w:type="spellStart"/>
+      <w:r>
+        <w:t>sam</w:t>
+      </w:r>
+      <w:proofErr w:type="spellEnd"/>
+      <w:r>
+        <w:t xml:space="preserve"> </w:t>
+      </w:r>
+      <w:proofErr w:type="spellStart"/>
+      <w:r>
+        <w:t>koristila</w:t>
+      </w:r>
+      <w:proofErr w:type="spellEnd"/>
+      <w:r>
+        <w:t xml:space="preserve"> </w:t>
+      </w:r>
+      <w:proofErr w:type="spellStart"/>
+      <w:r>
+        <w:t>strukture</w:t>
+      </w:r>
+      <w:proofErr w:type="spellEnd"/>
+      <w:r>
+        <w:t xml:space="preserve"> Graph (</w:t>
+      </w:r>
+      <w:proofErr w:type="spellStart"/>
+      <w:r>
+        <w:t>mreža</w:t>
+      </w:r>
+      <w:proofErr w:type="spellEnd"/>
+      <w:r>
+        <w:t xml:space="preserve"> </w:t>
+      </w:r>
+      <w:proofErr w:type="spellStart"/>
+      <w:r>
+        <w:t>gradova</w:t>
+      </w:r>
+      <w:proofErr w:type="spellEnd"/>
+      <w:r>
+        <w:t xml:space="preserve"> </w:t>
+      </w:r>
+      <w:proofErr w:type="spellStart"/>
+      <w:r>
+        <w:t>i</w:t>
+      </w:r>
+      <w:proofErr w:type="spellEnd"/>
+      <w:r>
+        <w:t xml:space="preserve"> </w:t>
+      </w:r>
+      <w:proofErr w:type="spellStart"/>
+      <w:r>
+        <w:t>veza</w:t>
+      </w:r>
+      <w:proofErr w:type="spellEnd"/>
+      <w:r>
+        <w:t xml:space="preserve">), Node </w:t>
+      </w:r>
+      <w:proofErr w:type="spellStart"/>
+      <w:r>
+        <w:t>i</w:t>
+      </w:r>
+      <w:proofErr w:type="spellEnd"/>
+      <w:r>
+        <w:t xml:space="preserve"> Edge (</w:t>
+      </w:r>
+      <w:proofErr w:type="spellStart"/>
+      <w:r>
+        <w:t>čvorovi</w:t>
+      </w:r>
+      <w:proofErr w:type="spellEnd"/>
+      <w:r>
+        <w:t xml:space="preserve"> </w:t>
+      </w:r>
+      <w:proofErr w:type="spellStart"/>
+      <w:r>
+        <w:t>su</w:t>
+      </w:r>
+      <w:proofErr w:type="spellEnd"/>
+      <w:r>
+        <w:t xml:space="preserve"> </w:t>
+      </w:r>
+      <w:proofErr w:type="spellStart"/>
+      <w:r>
+        <w:t>gradovi</w:t>
+      </w:r>
+      <w:proofErr w:type="spellEnd"/>
+      <w:r>
+        <w:t xml:space="preserve">, </w:t>
+      </w:r>
+      <w:proofErr w:type="gramStart"/>
+      <w:r>
+        <w:t>a</w:t>
+      </w:r>
+      <w:proofErr w:type="gramEnd"/>
+      <w:r>
+        <w:t xml:space="preserve"> </w:t>
+      </w:r>
+      <w:proofErr w:type="spellStart"/>
+      <w:r>
+        <w:t>ivice</w:t>
+      </w:r>
+      <w:proofErr w:type="spellEnd"/>
+      <w:r>
+        <w:t xml:space="preserve"> </w:t>
+      </w:r>
+      <w:proofErr w:type="spellStart"/>
+      <w:r>
+        <w:t>su</w:t>
+      </w:r>
+      <w:proofErr w:type="spellEnd"/>
+      <w:r>
+        <w:t xml:space="preserve"> </w:t>
+      </w:r>
+      <w:proofErr w:type="spellStart"/>
+      <w:r>
+        <w:t>polasci</w:t>
+      </w:r>
+      <w:proofErr w:type="spellEnd"/>
+      <w:r>
+        <w:t xml:space="preserve"> </w:t>
+      </w:r>
+      <w:proofErr w:type="spellStart"/>
+      <w:r>
+        <w:t>između</w:t>
+      </w:r>
+      <w:proofErr w:type="spellEnd"/>
+      <w:r>
+        <w:t xml:space="preserve"> </w:t>
+      </w:r>
+      <w:proofErr w:type="spellStart"/>
+      <w:r>
+        <w:t>gradova</w:t>
+      </w:r>
+      <w:proofErr w:type="spellEnd"/>
+      <w:r>
+        <w:t xml:space="preserve">). Lista Route </w:t>
+      </w:r>
+      <w:proofErr w:type="spellStart"/>
+      <w:r>
+        <w:t>objekata</w:t>
+      </w:r>
+      <w:proofErr w:type="spellEnd"/>
+      <w:r>
+        <w:t xml:space="preserve"> </w:t>
+      </w:r>
+      <w:proofErr w:type="spellStart"/>
+      <w:r>
+        <w:t>predstavlja</w:t>
+      </w:r>
+      <w:proofErr w:type="spellEnd"/>
+      <w:r>
+        <w:t xml:space="preserve"> </w:t>
+      </w:r>
+      <w:proofErr w:type="spellStart"/>
+      <w:r>
+        <w:t>putanju</w:t>
+      </w:r>
+      <w:proofErr w:type="spellEnd"/>
+      <w:r>
+        <w:t xml:space="preserve"> od </w:t>
+      </w:r>
+      <w:proofErr w:type="spellStart"/>
+      <w:r>
+        <w:t>grada</w:t>
+      </w:r>
+      <w:proofErr w:type="spellEnd"/>
+      <w:r>
+        <w:t xml:space="preserve"> A do </w:t>
+      </w:r>
+      <w:proofErr w:type="spellStart"/>
+      <w:r>
+        <w:t>grada</w:t>
+      </w:r>
+      <w:proofErr w:type="spellEnd"/>
+      <w:r>
+        <w:t xml:space="preserve"> B </w:t>
+      </w:r>
+      <w:proofErr w:type="spellStart"/>
+      <w:r>
+        <w:t>sa</w:t>
+      </w:r>
+      <w:proofErr w:type="spellEnd"/>
+      <w:r>
+        <w:t xml:space="preserve"> </w:t>
+      </w:r>
+      <w:proofErr w:type="spellStart"/>
+      <w:r>
+        <w:t>informacijama</w:t>
+      </w:r>
+      <w:proofErr w:type="spellEnd"/>
+      <w:r>
+        <w:t xml:space="preserve"> o </w:t>
+      </w:r>
+      <w:proofErr w:type="spellStart"/>
+      <w:r>
+        <w:t>međugradovima</w:t>
+      </w:r>
+      <w:proofErr w:type="spellEnd"/>
+      <w:r>
+        <w:t xml:space="preserve"> </w:t>
+      </w:r>
+      <w:proofErr w:type="spellStart"/>
+      <w:r>
+        <w:t>i</w:t>
+      </w:r>
+      <w:proofErr w:type="spellEnd"/>
+      <w:r>
+        <w:t xml:space="preserve"> </w:t>
+      </w:r>
+      <w:proofErr w:type="spellStart"/>
+      <w:r>
+        <w:t>polascima</w:t>
+      </w:r>
+      <w:proofErr w:type="spellEnd"/>
+      <w:r>
+        <w:t xml:space="preserve"> </w:t>
+      </w:r>
+      <w:proofErr w:type="spellStart"/>
+      <w:r>
+        <w:t>između</w:t>
+      </w:r>
+      <w:proofErr w:type="spellEnd"/>
+      <w:r>
+        <w:t xml:space="preserve"> </w:t>
+      </w:r>
+      <w:proofErr w:type="spellStart"/>
+      <w:r>
+        <w:t>njih</w:t>
+      </w:r>
+      <w:proofErr w:type="spellEnd"/>
+      <w:r>
+        <w:t xml:space="preserve">. </w:t>
+      </w:r>
+      <w:proofErr w:type="spellStart"/>
+      <w:r>
+        <w:t>PriorityQueue</w:t>
+      </w:r>
+      <w:proofErr w:type="spellEnd"/>
+      <w:r>
+        <w:t xml:space="preserve"> </w:t>
+      </w:r>
+      <w:proofErr w:type="spellStart"/>
+      <w:r>
+        <w:t>čuva</w:t>
+      </w:r>
+      <w:proofErr w:type="spellEnd"/>
+      <w:r>
+        <w:t xml:space="preserve"> </w:t>
+      </w:r>
+      <w:proofErr w:type="spellStart"/>
+      <w:r>
+        <w:t>potencijalne</w:t>
+      </w:r>
+      <w:proofErr w:type="spellEnd"/>
+      <w:r>
+        <w:t xml:space="preserve"> </w:t>
+      </w:r>
+      <w:proofErr w:type="spellStart"/>
+      <w:r>
+        <w:t>alternativne</w:t>
+      </w:r>
+      <w:proofErr w:type="spellEnd"/>
+      <w:r>
+        <w:t xml:space="preserve"> </w:t>
+      </w:r>
+      <w:proofErr w:type="spellStart"/>
+      <w:r>
+        <w:t>puteve</w:t>
+      </w:r>
+      <w:proofErr w:type="spellEnd"/>
+      <w:r>
+        <w:t xml:space="preserve">, </w:t>
+      </w:r>
+      <w:proofErr w:type="spellStart"/>
+      <w:r>
+        <w:t>sortirane</w:t>
+      </w:r>
+      <w:proofErr w:type="spellEnd"/>
+      <w:r>
+        <w:t xml:space="preserve"> </w:t>
+      </w:r>
+      <w:proofErr w:type="spellStart"/>
+      <w:r>
+        <w:t>prema</w:t>
+      </w:r>
+      <w:proofErr w:type="spellEnd"/>
+      <w:r>
+        <w:t xml:space="preserve"> </w:t>
+      </w:r>
+      <w:proofErr w:type="spellStart"/>
+      <w:r>
+        <w:t>odabranom</w:t>
+      </w:r>
+      <w:proofErr w:type="spellEnd"/>
+      <w:r>
+        <w:t xml:space="preserve"> </w:t>
+      </w:r>
+      <w:proofErr w:type="spellStart"/>
+      <w:r>
+        <w:t>kriterijumu</w:t>
+      </w:r>
+      <w:proofErr w:type="spellEnd"/>
+      <w:r>
+        <w:t xml:space="preserve">. </w:t>
+      </w:r>
+    </w:p>
+    <w:p>
+      <w:pPr>
+        <w:ind w:firstLine="720"/>
+        <w:jc w:val="both"/>
+      </w:pPr>
+      <w:r>
+        <w:t xml:space="preserve">Yen </w:t>
+      </w:r>
+      <w:proofErr w:type="spellStart"/>
+      <w:r>
+        <w:t>funkcioniše</w:t>
+      </w:r>
+      <w:proofErr w:type="spellEnd"/>
+      <w:r>
+        <w:t xml:space="preserve"> </w:t>
+      </w:r>
+      <w:proofErr w:type="spellStart"/>
+      <w:r>
+        <w:t>tako</w:t>
+      </w:r>
+      <w:proofErr w:type="spellEnd"/>
+      <w:r>
+        <w:t xml:space="preserve"> </w:t>
+      </w:r>
+      <w:proofErr w:type="spellStart"/>
+      <w:r>
+        <w:t>što</w:t>
+      </w:r>
+      <w:proofErr w:type="spellEnd"/>
+      <w:r>
+        <w:t xml:space="preserve"> </w:t>
+      </w:r>
+      <w:proofErr w:type="spellStart"/>
+      <w:r>
+        <w:t>uklanja</w:t>
+      </w:r>
+      <w:proofErr w:type="spellEnd"/>
+      <w:r>
+        <w:t xml:space="preserve"> </w:t>
+      </w:r>
+      <w:proofErr w:type="spellStart"/>
+      <w:r>
+        <w:t>dijelove</w:t>
+      </w:r>
+      <w:proofErr w:type="spellEnd"/>
+      <w:r>
+        <w:t xml:space="preserve"> </w:t>
+      </w:r>
+      <w:proofErr w:type="spellStart"/>
+      <w:r>
+        <w:t>prethodnih</w:t>
+      </w:r>
+      <w:proofErr w:type="spellEnd"/>
+      <w:r>
+        <w:t xml:space="preserve"> </w:t>
+      </w:r>
+      <w:proofErr w:type="spellStart"/>
+      <w:r>
+        <w:t>puteva</w:t>
+      </w:r>
+      <w:proofErr w:type="spellEnd"/>
+      <w:r>
+        <w:t xml:space="preserve"> </w:t>
+      </w:r>
+      <w:proofErr w:type="spellStart"/>
+      <w:r>
+        <w:t>i</w:t>
+      </w:r>
+      <w:proofErr w:type="spellEnd"/>
+      <w:r>
+        <w:t xml:space="preserve"> </w:t>
+      </w:r>
+      <w:proofErr w:type="spellStart"/>
+      <w:r>
+        <w:t>tako</w:t>
+      </w:r>
+      <w:proofErr w:type="spellEnd"/>
+      <w:r>
+        <w:t xml:space="preserve"> </w:t>
+      </w:r>
+      <w:proofErr w:type="spellStart"/>
+      <w:r>
+        <w:t>forsira</w:t>
+      </w:r>
+      <w:proofErr w:type="spellEnd"/>
+      <w:r>
+        <w:t xml:space="preserve"> </w:t>
+      </w:r>
+      <w:proofErr w:type="spellStart"/>
+      <w:r>
+        <w:t>algoritam</w:t>
+      </w:r>
+      <w:proofErr w:type="spellEnd"/>
+      <w:r>
+        <w:t xml:space="preserve"> da </w:t>
+      </w:r>
+      <w:proofErr w:type="spellStart"/>
+      <w:r>
+        <w:t>traži</w:t>
+      </w:r>
+      <w:proofErr w:type="spellEnd"/>
+      <w:r>
+        <w:t xml:space="preserve"> </w:t>
+      </w:r>
+      <w:proofErr w:type="spellStart"/>
+      <w:r>
+        <w:t>drugačije</w:t>
+      </w:r>
+      <w:proofErr w:type="spellEnd"/>
+      <w:r>
+        <w:t xml:space="preserve"> </w:t>
+      </w:r>
+      <w:proofErr w:type="spellStart"/>
+      <w:r>
+        <w:t>rute</w:t>
+      </w:r>
+      <w:proofErr w:type="spellEnd"/>
+      <w:r>
+        <w:t xml:space="preserve">. </w:t>
+      </w:r>
+      <w:proofErr w:type="spellStart"/>
+      <w:r>
+        <w:t>PriorityQueue</w:t>
+      </w:r>
+      <w:proofErr w:type="spellEnd"/>
+      <w:r>
+        <w:t xml:space="preserve"> </w:t>
+      </w:r>
+      <w:proofErr w:type="spellStart"/>
+      <w:r>
+        <w:t>sl</w:t>
+      </w:r>
+      <w:r>
+        <w:t>u</w:t>
+      </w:r>
+      <w:r>
+        <w:t>ži</w:t>
+      </w:r>
+      <w:proofErr w:type="spellEnd"/>
+      <w:r>
+        <w:t xml:space="preserve"> za </w:t>
+      </w:r>
+      <w:proofErr w:type="spellStart"/>
+      <w:r>
+        <w:t>sortiranje</w:t>
+      </w:r>
+      <w:proofErr w:type="spellEnd"/>
+      <w:r>
+        <w:t xml:space="preserve"> </w:t>
+      </w:r>
+      <w:proofErr w:type="spellStart"/>
+      <w:r>
+        <w:t>i</w:t>
+      </w:r>
+      <w:proofErr w:type="spellEnd"/>
+      <w:r>
+        <w:t xml:space="preserve"> </w:t>
+      </w:r>
+      <w:proofErr w:type="spellStart"/>
+      <w:r>
+        <w:t>uzimanje</w:t>
+      </w:r>
+      <w:proofErr w:type="spellEnd"/>
+      <w:r>
+        <w:t xml:space="preserve"> </w:t>
+      </w:r>
+      <w:proofErr w:type="spellStart"/>
+      <w:r>
+        <w:t>sljedeće</w:t>
+      </w:r>
+      <w:proofErr w:type="spellEnd"/>
+      <w:r>
+        <w:t xml:space="preserve"> </w:t>
+      </w:r>
+      <w:proofErr w:type="spellStart"/>
+      <w:r>
+        <w:t>najbolje</w:t>
+      </w:r>
+      <w:proofErr w:type="spellEnd"/>
+      <w:r>
+        <w:t xml:space="preserve"> </w:t>
+      </w:r>
+      <w:proofErr w:type="spellStart"/>
+      <w:r>
+        <w:t>rute</w:t>
+      </w:r>
+      <w:proofErr w:type="spellEnd"/>
+      <w:r>
+        <w:t>.</w:t>
+      </w:r>
+    </w:p>
+    <w:p>
+      <w:pPr>
+        <w:ind w:firstLine="720"/>
+        <w:jc w:val="both"/>
       </w:pPr>
     </w:p>
     <w:sectPr>
@@ -1812,6 +2474,7 @@
   <w:style w:type="character" w:default="1" w:styleId="DefaultParagraphFont">
     <w:name w:val="Default Paragraph Font"/>
     <w:uiPriority w:val="1"/>
+    <w:semiHidden/>
     <w:unhideWhenUsed/>
   </w:style>
   <w:style w:type="table" w:default="1" w:styleId="TableNormal">

</xml_diff>